<commit_message>
Fixed the wrong buffer from ARRAY to ELEMENT on the index buffer load
</commit_message>
<xml_diff>
--- a/Checkpoints/Checkpoint #2 (INFO-3111).docx
+++ b/Checkpoints/Checkpoint #2 (INFO-3111).docx
@@ -212,6 +212,177 @@
             <w:pPr>
               <w:spacing w:after="0" w:line="240" w:lineRule="auto"/>
             </w:pPr>
+            <w:r>
+              <w:rPr>
+                <w:noProof/>
+              </w:rPr>
+              <mc:AlternateContent>
+                <mc:Choice Requires="wps">
+                  <w:drawing>
+                    <wp:anchor distT="0" distB="0" distL="114300" distR="114300" simplePos="0" relativeHeight="251661312" behindDoc="0" locked="0" layoutInCell="1" allowOverlap="1" wp14:anchorId="36CBCD27" wp14:editId="67946CDC">
+                      <wp:simplePos x="0" y="0"/>
+                      <wp:positionH relativeFrom="column">
+                        <wp:posOffset>-742486</wp:posOffset>
+                      </wp:positionH>
+                      <wp:positionV relativeFrom="paragraph">
+                        <wp:posOffset>1292225</wp:posOffset>
+                      </wp:positionV>
+                      <wp:extent cx="7845936" cy="1828800"/>
+                      <wp:effectExtent l="400050" t="1809750" r="384175" b="1812925"/>
+                      <wp:wrapNone/>
+                      <wp:docPr id="1978822832" name="Text Box 1"/>
+                      <wp:cNvGraphicFramePr/>
+                      <a:graphic xmlns:a="http://schemas.openxmlformats.org/drawingml/2006/main">
+                        <a:graphicData uri="http://schemas.microsoft.com/office/word/2010/wordprocessingShape">
+                          <wps:wsp>
+                            <wps:cNvSpPr txBox="1"/>
+                            <wps:spPr>
+                              <a:xfrm rot="19479132">
+                                <a:off x="0" y="0"/>
+                                <a:ext cx="7845936" cy="1828800"/>
+                              </a:xfrm>
+                              <a:prstGeom prst="rect">
+                                <a:avLst/>
+                              </a:prstGeom>
+                              <a:noFill/>
+                              <a:ln>
+                                <a:noFill/>
+                              </a:ln>
+                            </wps:spPr>
+                            <wps:txbx>
+                              <w:txbxContent>
+                                <w:p>
+                                  <w:pPr>
+                                    <w:spacing w:after="0" w:line="240" w:lineRule="auto"/>
+                                    <w:jc w:val="center"/>
+                                    <w:rPr>
+                                      <w:b/>
+                                      <w:bCs/>
+                                      <w:color w:val="5B9BD5" w:themeColor="accent5"/>
+                                      <w:sz w:val="180"/>
+                                      <w:szCs w:val="180"/>
+                                      <w14:shadow w14:blurRad="12700" w14:dist="38100" w14:dir="2700000" w14:sx="100000" w14:sy="100000" w14:kx="0" w14:ky="0" w14:algn="tl">
+                                        <w14:schemeClr w14:val="accent5">
+                                          <w14:lumMod w14:val="60000"/>
+                                          <w14:lumOff w14:val="40000"/>
+                                        </w14:schemeClr>
+                                      </w14:shadow>
+                                      <w14:textOutline w14:w="9525" w14:cap="flat" w14:cmpd="sng" w14:algn="ctr">
+                                        <w14:solidFill>
+                                          <w14:schemeClr w14:val="bg1"/>
+                                        </w14:solidFill>
+                                        <w14:prstDash w14:val="solid"/>
+                                        <w14:round/>
+                                      </w14:textOutline>
+                                    </w:rPr>
+                                  </w:pPr>
+                                  <w:r>
+                                    <w:rPr>
+                                      <w:b/>
+                                      <w:bCs/>
+                                      <w:color w:val="5B9BD5" w:themeColor="accent5"/>
+                                      <w:sz w:val="180"/>
+                                      <w:szCs w:val="180"/>
+                                      <w14:shadow w14:blurRad="12700" w14:dist="38100" w14:dir="2700000" w14:sx="100000" w14:sy="100000" w14:kx="0" w14:ky="0" w14:algn="tl">
+                                        <w14:schemeClr w14:val="accent5">
+                                          <w14:lumMod w14:val="60000"/>
+                                          <w14:lumOff w14:val="40000"/>
+                                        </w14:schemeClr>
+                                      </w14:shadow>
+                                      <w14:textOutline w14:w="9525" w14:cap="flat" w14:cmpd="sng" w14:algn="ctr">
+                                        <w14:solidFill>
+                                          <w14:schemeClr w14:val="bg1"/>
+                                        </w14:solidFill>
+                                        <w14:prstDash w14:val="solid"/>
+                                        <w14:round/>
+                                      </w14:textOutline>
+                                    </w:rPr>
+                                    <w:t>This will be combined with checkpoint #3</w:t>
+                                  </w:r>
+                                </w:p>
+                              </w:txbxContent>
+                            </wps:txbx>
+                            <wps:bodyPr rot="0" spcFirstLastPara="0" vertOverflow="overflow" horzOverflow="overflow" vert="horz" wrap="square" lIns="91440" tIns="45720" rIns="91440" bIns="45720" numCol="1" spcCol="0" rtlCol="0" fromWordArt="0" anchor="t" anchorCtr="0" forceAA="0" compatLnSpc="1">
+                              <a:prstTxWarp prst="textNoShape">
+                                <a:avLst/>
+                              </a:prstTxWarp>
+                              <a:spAutoFit/>
+                            </wps:bodyPr>
+                          </wps:wsp>
+                        </a:graphicData>
+                      </a:graphic>
+                      <wp14:sizeRelH relativeFrom="margin">
+                        <wp14:pctWidth>0</wp14:pctWidth>
+                      </wp14:sizeRelH>
+                    </wp:anchor>
+                  </w:drawing>
+                </mc:Choice>
+                <mc:Fallback>
+                  <w:pict>
+                    <v:shapetype w14:anchorId="36CBCD27" id="_x0000_t202" coordsize="21600,21600" o:spt="202" path="m,l,21600r21600,l21600,xe">
+                      <v:stroke joinstyle="miter"/>
+                      <v:path gradientshapeok="t" o:connecttype="rect"/>
+                    </v:shapetype>
+                    <v:shape id="Text Box 1" o:spid="_x0000_s1026" type="#_x0000_t202" style="position:absolute;margin-left:-58.45pt;margin-top:101.75pt;width:617.8pt;height:2in;rotation:-2316553fd;z-index:251661312;visibility:visible;mso-wrap-style:square;mso-width-percent:0;mso-wrap-distance-left:9pt;mso-wrap-distance-top:0;mso-wrap-distance-right:9pt;mso-wrap-distance-bottom:0;mso-position-horizontal:absolute;mso-position-horizontal-relative:text;mso-position-vertical:absolute;mso-position-vertical-relative:text;mso-width-percent:0;mso-width-relative:margin;v-text-anchor:top" o:gfxdata="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" filled="f" stroked="f">
+                      <v:fill o:detectmouseclick="t"/>
+                      <v:textbox style="mso-fit-shape-to-text:t">
+                        <w:txbxContent>
+                          <w:p>
+                            <w:pPr>
+                              <w:spacing w:after="0" w:line="240" w:lineRule="auto"/>
+                              <w:jc w:val="center"/>
+                              <w:rPr>
+                                <w:b/>
+                                <w:bCs/>
+                                <w:color w:val="5B9BD5" w:themeColor="accent5"/>
+                                <w:sz w:val="180"/>
+                                <w:szCs w:val="180"/>
+                                <w14:shadow w14:blurRad="12700" w14:dist="38100" w14:dir="2700000" w14:sx="100000" w14:sy="100000" w14:kx="0" w14:ky="0" w14:algn="tl">
+                                  <w14:schemeClr w14:val="accent5">
+                                    <w14:lumMod w14:val="60000"/>
+                                    <w14:lumOff w14:val="40000"/>
+                                  </w14:schemeClr>
+                                </w14:shadow>
+                                <w14:textOutline w14:w="9525" w14:cap="flat" w14:cmpd="sng" w14:algn="ctr">
+                                  <w14:solidFill>
+                                    <w14:schemeClr w14:val="bg1"/>
+                                  </w14:solidFill>
+                                  <w14:prstDash w14:val="solid"/>
+                                  <w14:round/>
+                                </w14:textOutline>
+                              </w:rPr>
+                            </w:pPr>
+                            <w:r>
+                              <w:rPr>
+                                <w:b/>
+                                <w:bCs/>
+                                <w:color w:val="5B9BD5" w:themeColor="accent5"/>
+                                <w:sz w:val="180"/>
+                                <w:szCs w:val="180"/>
+                                <w14:shadow w14:blurRad="12700" w14:dist="38100" w14:dir="2700000" w14:sx="100000" w14:sy="100000" w14:kx="0" w14:ky="0" w14:algn="tl">
+                                  <w14:schemeClr w14:val="accent5">
+                                    <w14:lumMod w14:val="60000"/>
+                                    <w14:lumOff w14:val="40000"/>
+                                  </w14:schemeClr>
+                                </w14:shadow>
+                                <w14:textOutline w14:w="9525" w14:cap="flat" w14:cmpd="sng" w14:algn="ctr">
+                                  <w14:solidFill>
+                                    <w14:schemeClr w14:val="bg1"/>
+                                  </w14:solidFill>
+                                  <w14:prstDash w14:val="solid"/>
+                                  <w14:round/>
+                                </w14:textOutline>
+                              </w:rPr>
+                              <w:t>This will be combined with checkpoint #3</w:t>
+                            </w:r>
+                          </w:p>
+                        </w:txbxContent>
+                      </v:textbox>
+                    </v:shape>
+                  </w:pict>
+                </mc:Fallback>
+              </mc:AlternateContent>
+            </w:r>
             <w:r>
               <w:rPr>
                 <w:b/>

</xml_diff>